<commit_message>
Switch middle-school lesson materials to individual work
Deck and worksheet now assume each student makes their own song on a
no-signup AI music site, with a Padlet backup library, and gives
partner feedback instead of group roles.

Co-Authored-By: Claude Opus 5.5 <noreply@anthropic.com>
Claude-Session: https://claude.ai/code/session_01LJssAQrTFX97gi8zMMX3x4
</commit_message>
<xml_diff>
--- a/평택여고_2026-10-21/활동지_AI뮤직비디오.docx
+++ b/평택여고_2026-10-21/활동지_AI뮤직비디오.docx
@@ -42,7 +42,7 @@
         <w:pStyle w:val="FirstParagraph"/>
       </w:pPr>
       <w:r>
-        <w:t xml:space="preserve">평택여자고등학교 콘텐츠 제작 학과체험 · 2차시 — 오늘 우리 모둠은 AI로 노래를 만들고, 휴대폰으로 30초~1분짜리 뮤직비디오를 완성합니다.</w:t>
+        <w:t xml:space="preserve">평택여자고등학교 콘텐츠 제작 학과체험 · 2차시 — 오늘 나는 AI로 나만의 노래를 만들고, 휴대폰으로 30초~1분짜리 나만의 뮤직비디오를 완성합니다.</w:t>
       </w:r>
     </w:p>
     <w:tbl>
@@ -94,7 +94,7 @@
               <w:jc w:val="left"/>
             </w:pPr>
             <w:r>
-              <w:t xml:space="preserve">모둠</w:t>
+              <w:t xml:space="preserve">번호</w:t>
             </w:r>
           </w:p>
         </w:tc>
@@ -144,7 +144,7 @@
               <w:jc w:val="left"/>
             </w:pPr>
             <w:r>
-              <w:t xml:space="preserve">모둠</w:t>
+              <w:t xml:space="preserve">번</w:t>
             </w:r>
           </w:p>
         </w:tc>
@@ -158,13 +158,135 @@
         </w:tc>
       </w:tr>
     </w:tbl>
-    <w:bookmarkStart w:id="20" w:name="우리-모둠-역할"/>
+    <w:p>
+      <w:pPr>
+        <w:pStyle w:val="BodyText"/>
+      </w:pPr>
+      <w:r>
+        <w:rPr>
+          <w:bCs/>
+          <w:b/>
+        </w:rPr>
+        <w:t xml:space="preserve">오늘 나의 5단계</w:t>
+      </w:r>
+      <w:r>
+        <w:t xml:space="preserve"> </w:t>
+      </w:r>
+      <w:r>
+        <w:t xml:space="preserve">— ① 기획 → ② AI 노래 만들기 → ③ 촬영 → ④ CapCut 편집 → ⑤ 패들렛 공유 · 짝 감상</w:t>
+      </w:r>
+    </w:p>
+    <w:bookmarkStart w:id="20" w:name="차시-step-1-노래-주제-고르기-3분"/>
     <w:p>
       <w:pPr>
         <w:pStyle w:val="Heading2"/>
       </w:pPr>
       <w:r>
-        <w:t xml:space="preserve">우리 모둠 역할</w:t>
+        <w:t xml:space="preserve">1차시 · STEP 1 노래 주제 고르기 (3분)</w:t>
+      </w:r>
+    </w:p>
+    <w:p>
+      <w:pPr>
+        <w:pStyle w:val="FirstParagraph"/>
+      </w:pPr>
+      <w:r>
+        <w:t xml:space="preserve">하나에 ✓ 표시하거나, 나만의 주제를 적어 보세요.</w:t>
+      </w:r>
+    </w:p>
+    <w:p>
+      <w:pPr>
+        <w:numPr>
+          <w:ilvl w:val="0"/>
+          <w:numId w:val="1001"/>
+        </w:numPr>
+        <w:pStyle w:val="Compact"/>
+      </w:pPr>
+      <w:r>
+        <w:t xml:space="preserve">우리 학교 · 우리 반</w:t>
+      </w:r>
+    </w:p>
+    <w:p>
+      <w:pPr>
+        <w:numPr>
+          <w:ilvl w:val="0"/>
+          <w:numId w:val="1001"/>
+        </w:numPr>
+        <w:pStyle w:val="Compact"/>
+      </w:pPr>
+      <w:r>
+        <w:t xml:space="preserve">나의 꿈</w:t>
+      </w:r>
+    </w:p>
+    <w:p>
+      <w:pPr>
+        <w:numPr>
+          <w:ilvl w:val="0"/>
+          <w:numId w:val="1001"/>
+        </w:numPr>
+        <w:pStyle w:val="Compact"/>
+      </w:pPr>
+      <w:r>
+        <w:t xml:space="preserve">친구와 우정</w:t>
+      </w:r>
+    </w:p>
+    <w:p>
+      <w:pPr>
+        <w:numPr>
+          <w:ilvl w:val="0"/>
+          <w:numId w:val="1001"/>
+        </w:numPr>
+        <w:pStyle w:val="Compact"/>
+      </w:pPr>
+      <w:r>
+        <w:t xml:space="preserve">좋아하는 계절</w:t>
+      </w:r>
+    </w:p>
+    <w:p>
+      <w:pPr>
+        <w:numPr>
+          <w:ilvl w:val="0"/>
+          <w:numId w:val="1001"/>
+        </w:numPr>
+        <w:pStyle w:val="Compact"/>
+      </w:pPr>
+      <w:r>
+        <w:t xml:space="preserve">나만의 주제: ______________________________</w:t>
+      </w:r>
+    </w:p>
+    <w:p>
+      <w:pPr>
+        <w:pStyle w:val="FirstParagraph"/>
+      </w:pPr>
+      <w:r>
+        <w:rPr>
+          <w:bCs/>
+          <w:b/>
+        </w:rPr>
+        <w:t xml:space="preserve">내 노래 제목:</w:t>
+      </w:r>
+      <w:r>
+        <w:t xml:space="preserve"> </w:t>
+      </w:r>
+      <w:r>
+        <w:t xml:space="preserve">________________________________________________</w:t>
+      </w:r>
+    </w:p>
+    <w:bookmarkEnd w:id="20"/>
+    <w:bookmarkStart w:id="21" w:name="step-2-음악-프롬프트-만들기-4분"/>
+    <w:p>
+      <w:pPr>
+        <w:pStyle w:val="Heading2"/>
+      </w:pPr>
+      <w:r>
+        <w:t xml:space="preserve">STEP 2 음악 프롬프트 만들기 (4분)</w:t>
+      </w:r>
+    </w:p>
+    <w:p>
+      <w:pPr>
+        <w:pStyle w:val="FirstParagraph"/>
+      </w:pPr>
+      <w:r>
+        <w:t xml:space="preserve">여섯 칸을 채우면 AI가 내가 원하는 노래에 가까워져요. 구체적일수록 좋아요!</w:t>
       </w:r>
     </w:p>
     <w:tbl>
@@ -191,31 +313,31 @@
               <w:jc w:val="left"/>
             </w:pPr>
             <w:r>
-              <w:t xml:space="preserve">역할</w:t>
-            </w:r>
-          </w:p>
-        </w:tc>
-        <w:tc>
-          <w:tcPr/>
-          <w:p>
-            <w:pPr>
-              <w:pStyle w:val="Compact"/>
-              <w:jc w:val="left"/>
-            </w:pPr>
-            <w:r>
-              <w:t xml:space="preserve">하는 일</w:t>
-            </w:r>
-          </w:p>
-        </w:tc>
-        <w:tc>
-          <w:tcPr/>
-          <w:p>
-            <w:pPr>
-              <w:pStyle w:val="Compact"/>
-              <w:jc w:val="left"/>
-            </w:pPr>
-            <w:r>
-              <w:t xml:space="preserve">이름</w:t>
+              <w:t xml:space="preserve">요소</w:t>
+            </w:r>
+          </w:p>
+        </w:tc>
+        <w:tc>
+          <w:tcPr/>
+          <w:p>
+            <w:pPr>
+              <w:pStyle w:val="Compact"/>
+              <w:jc w:val="left"/>
+            </w:pPr>
+            <w:r>
+              <w:t xml:space="preserve">고를 수 있는 예시</w:t>
+            </w:r>
+          </w:p>
+        </w:tc>
+        <w:tc>
+          <w:tcPr/>
+          <w:p>
+            <w:pPr>
+              <w:pStyle w:val="Compact"/>
+              <w:jc w:val="left"/>
+            </w:pPr>
+            <w:r>
+              <w:t xml:space="preserve">나의 선택</w:t>
             </w:r>
           </w:p>
         </w:tc>
@@ -229,19 +351,19 @@
               <w:jc w:val="left"/>
             </w:pPr>
             <w:r>
-              <w:t xml:space="preserve">작사가</w:t>
-            </w:r>
-          </w:p>
-        </w:tc>
-        <w:tc>
-          <w:tcPr/>
-          <w:p>
-            <w:pPr>
-              <w:pStyle w:val="Compact"/>
-              <w:jc w:val="left"/>
-            </w:pPr>
-            <w:r>
-              <w:t xml:space="preserve">가사 8줄을 정리해요</w:t>
+              <w:t xml:space="preserve">장르</w:t>
+            </w:r>
+          </w:p>
+        </w:tc>
+        <w:tc>
+          <w:tcPr/>
+          <w:p>
+            <w:pPr>
+              <w:pStyle w:val="Compact"/>
+              <w:jc w:val="left"/>
+            </w:pPr>
+            <w:r>
+              <w:t xml:space="preserve">K-pop, 발라드, 힙합, 록, 어쿠스틱, 로파이</w:t>
             </w:r>
           </w:p>
         </w:tc>
@@ -263,19 +385,19 @@
               <w:jc w:val="left"/>
             </w:pPr>
             <w:r>
-              <w:t xml:space="preserve">프롬프터</w:t>
-            </w:r>
-          </w:p>
-        </w:tc>
-        <w:tc>
-          <w:tcPr/>
-          <w:p>
-            <w:pPr>
-              <w:pStyle w:val="Compact"/>
-              <w:jc w:val="left"/>
-            </w:pPr>
-            <w:r>
-              <w:t xml:space="preserve">음악·이미지 프롬프트를 완성해요</w:t>
+              <w:t xml:space="preserve">분위기</w:t>
+            </w:r>
+          </w:p>
+        </w:tc>
+        <w:tc>
+          <w:tcPr/>
+          <w:p>
+            <w:pPr>
+              <w:pStyle w:val="Compact"/>
+              <w:jc w:val="left"/>
+            </w:pPr>
+            <w:r>
+              <w:t xml:space="preserve">신나는, 청량한, 잔잔한, 감동적인, 웃긴</w:t>
             </w:r>
           </w:p>
         </w:tc>
@@ -297,19 +419,19 @@
               <w:jc w:val="left"/>
             </w:pPr>
             <w:r>
-              <w:t xml:space="preserve">감독</w:t>
-            </w:r>
-          </w:p>
-        </w:tc>
-        <w:tc>
-          <w:tcPr/>
-          <w:p>
-            <w:pPr>
-              <w:pStyle w:val="Compact"/>
-              <w:jc w:val="left"/>
-            </w:pPr>
-            <w:r>
-              <w:t xml:space="preserve">4컷 스토리보드와 촬영을 이끌어요</w:t>
+              <w:t xml:space="preserve">악기</w:t>
+            </w:r>
+          </w:p>
+        </w:tc>
+        <w:tc>
+          <w:tcPr/>
+          <w:p>
+            <w:pPr>
+              <w:pStyle w:val="Compact"/>
+              <w:jc w:val="left"/>
+            </w:pPr>
+            <w:r>
+              <w:t xml:space="preserve">피아노, 기타, 드럼, 신스, 현악기</w:t>
             </w:r>
           </w:p>
         </w:tc>
@@ -331,19 +453,19 @@
               <w:jc w:val="left"/>
             </w:pPr>
             <w:r>
-              <w:t xml:space="preserve">편집자</w:t>
-            </w:r>
-          </w:p>
-        </w:tc>
-        <w:tc>
-          <w:tcPr/>
-          <w:p>
-            <w:pPr>
-              <w:pStyle w:val="Compact"/>
-              <w:jc w:val="left"/>
-            </w:pPr>
-            <w:r>
-              <w:t xml:space="preserve">CapCut으로 영상을 편집해요</w:t>
+              <w:t xml:space="preserve">템포</w:t>
+            </w:r>
+          </w:p>
+        </w:tc>
+        <w:tc>
+          <w:tcPr/>
+          <w:p>
+            <w:pPr>
+              <w:pStyle w:val="Compact"/>
+              <w:jc w:val="left"/>
+            </w:pPr>
+            <w:r>
+              <w:t xml:space="preserve">빠른, 보통, 느린</w:t>
             </w:r>
           </w:p>
         </w:tc>
@@ -365,19 +487,53 @@
               <w:jc w:val="left"/>
             </w:pPr>
             <w:r>
-              <w:t xml:space="preserve">발표자</w:t>
-            </w:r>
-          </w:p>
-        </w:tc>
-        <w:tc>
-          <w:tcPr/>
-          <w:p>
-            <w:pPr>
-              <w:pStyle w:val="Compact"/>
-              <w:jc w:val="left"/>
-            </w:pPr>
-            <w:r>
-              <w:t xml:space="preserve">상영회에서 작품을 소개해요</w:t>
+              <w:t xml:space="preserve">보컬</w:t>
+            </w:r>
+          </w:p>
+        </w:tc>
+        <w:tc>
+          <w:tcPr/>
+          <w:p>
+            <w:pPr>
+              <w:pStyle w:val="Compact"/>
+              <w:jc w:val="left"/>
+            </w:pPr>
+            <w:r>
+              <w:t xml:space="preserve">여성 보컬, 남성 보컬, 합창, 보컬 없음</w:t>
+            </w:r>
+          </w:p>
+        </w:tc>
+        <w:tc>
+          <w:tcPr/>
+          <w:p>
+            <w:pPr>
+              <w:pStyle w:val="Compact"/>
+            </w:pPr>
+          </w:p>
+        </w:tc>
+      </w:tr>
+      <w:tr>
+        <w:tc>
+          <w:tcPr/>
+          <w:p>
+            <w:pPr>
+              <w:pStyle w:val="Compact"/>
+              <w:jc w:val="left"/>
+            </w:pPr>
+            <w:r>
+              <w:t xml:space="preserve">주제</w:t>
+            </w:r>
+          </w:p>
+        </w:tc>
+        <w:tc>
+          <w:tcPr/>
+          <w:p>
+            <w:pPr>
+              <w:pStyle w:val="Compact"/>
+              <w:jc w:val="left"/>
+            </w:pPr>
+            <w:r>
+              <w:t xml:space="preserve">STEP 1에서 고른 주제</w:t>
             </w:r>
           </w:p>
         </w:tc>
@@ -391,110 +547,59 @@
         </w:tc>
       </w:tr>
     </w:tbl>
-    <w:bookmarkEnd w:id="20"/>
-    <w:bookmarkStart w:id="21" w:name="차시-step-1-노래-주제-고르기-3분"/>
-    <w:p>
-      <w:pPr>
-        <w:pStyle w:val="Heading2"/>
-      </w:pPr>
-      <w:r>
-        <w:t xml:space="preserve">1차시 · STEP 1 노래 주제 고르기 (3분)</w:t>
-      </w:r>
-    </w:p>
-    <w:p>
-      <w:pPr>
-        <w:pStyle w:val="FirstParagraph"/>
-      </w:pPr>
-      <w:r>
-        <w:t xml:space="preserve">하나에 ✓ 표시하거나, 우리만의 주제를 적어 보세요.</w:t>
-      </w:r>
-    </w:p>
-    <w:p>
-      <w:pPr>
-        <w:numPr>
-          <w:ilvl w:val="0"/>
-          <w:numId w:val="1001"/>
-        </w:numPr>
-        <w:pStyle w:val="Compact"/>
-      </w:pPr>
-      <w:r>
-        <w:t xml:space="preserve">우리 학교 · 우리 반</w:t>
-      </w:r>
-    </w:p>
-    <w:p>
-      <w:pPr>
-        <w:numPr>
-          <w:ilvl w:val="0"/>
-          <w:numId w:val="1001"/>
-        </w:numPr>
-        <w:pStyle w:val="Compact"/>
-      </w:pPr>
-      <w:r>
-        <w:t xml:space="preserve">나의 꿈</w:t>
-      </w:r>
-    </w:p>
-    <w:p>
-      <w:pPr>
-        <w:numPr>
-          <w:ilvl w:val="0"/>
-          <w:numId w:val="1001"/>
-        </w:numPr>
-        <w:pStyle w:val="Compact"/>
-      </w:pPr>
-      <w:r>
-        <w:t xml:space="preserve">친구와 우정</w:t>
-      </w:r>
-    </w:p>
-    <w:p>
-      <w:pPr>
-        <w:numPr>
-          <w:ilvl w:val="0"/>
-          <w:numId w:val="1001"/>
-        </w:numPr>
-        <w:pStyle w:val="Compact"/>
-      </w:pPr>
-      <w:r>
-        <w:t xml:space="preserve">좋아하는 계절</w:t>
-      </w:r>
-    </w:p>
-    <w:p>
-      <w:pPr>
-        <w:numPr>
-          <w:ilvl w:val="0"/>
-          <w:numId w:val="1001"/>
-        </w:numPr>
-        <w:pStyle w:val="Compact"/>
-      </w:pPr>
-      <w:r>
-        <w:t xml:space="preserve">우리만의 주제: ______________________________</w:t>
-      </w:r>
-    </w:p>
-    <w:p>
-      <w:pPr>
-        <w:pStyle w:val="FirstParagraph"/>
+    <w:p>
+      <w:pPr>
+        <w:pStyle w:val="BodyText"/>
       </w:pPr>
       <w:r>
         <w:rPr>
           <w:bCs/>
           <w:b/>
         </w:rPr>
-        <w:t xml:space="preserve">우리 노래 제목:</w:t>
+        <w:t xml:space="preserve">예시</w:t>
       </w:r>
       <w:r>
         <w:t xml:space="preserve"> </w:t>
       </w:r>
       <w:r>
-        <w:t xml:space="preserve">________________________________________________</w:t>
+        <w:t xml:space="preserve">— "신나고 청량한 K-pop 댄스곡, 밝은 신스와 강한 드럼, 빠른 템포, 맑은 여성 보컬, 중학교 친구들과의 우정에 대한 노래"</w:t>
+      </w:r>
+    </w:p>
+    <w:p>
+      <w:pPr>
+        <w:pStyle w:val="BodyText"/>
+      </w:pPr>
+      <w:r>
+        <w:rPr>
+          <w:bCs/>
+          <w:b/>
+        </w:rPr>
+        <w:t xml:space="preserve">나의 완성 프롬프트</w:t>
+      </w:r>
+      <w:r>
+        <w:t xml:space="preserve"> </w:t>
+      </w:r>
+      <w:r>
+        <w:t xml:space="preserve">(여섯 칸을 한 문장으로)</w:t>
+      </w:r>
+      <w:r>
+        <w:br/>
+      </w:r>
+      <w:r>
+        <w:br/>
+      </w:r>
+      <w:r>
+        <w:br/>
       </w:r>
     </w:p>
     <w:bookmarkEnd w:id="21"/>
-    <w:bookmarkStart w:id="22" w:name="step-2-음악-프롬프트-만들기-4분"/>
+    <w:bookmarkStart w:id="22" w:name="step-3-가사-쓰기-5분"/>
     <w:p>
       <w:pPr>
         <w:pStyle w:val="Heading2"/>
       </w:pPr>
       <w:r>
-        <w:t xml:space="preserve">STEP 2 음악 프롬프트 만들기 (4분)</w:t>
+        <w:t xml:space="preserve">STEP 3 가사 쓰기 (5분)</w:t>
       </w:r>
     </w:p>
     <w:p>
@@ -502,7 +607,7 @@
         <w:pStyle w:val="FirstParagraph"/>
       </w:pPr>
       <w:r>
-        <w:t xml:space="preserve">여섯 칸을 채우면 AI가 우리가 원하는 노래에 가까워져요. 구체적일수록 좋아요!</w:t>
+        <w:t xml:space="preserve">대괄호 태그를 넣으면 AI가 노래의 흐름을 알아들어요. 후렴은 짧고, 따라 부르기 쉽게! 친구·연예인의 실제 이름은 넣지 않아요. 보컬이 안 되는 사이트라면 이 가사는 영상 자막으로 써요.</w:t>
       </w:r>
     </w:p>
     <w:tbl>
@@ -529,31 +634,31 @@
               <w:jc w:val="left"/>
             </w:pPr>
             <w:r>
-              <w:t xml:space="preserve">요소</w:t>
-            </w:r>
-          </w:p>
-        </w:tc>
-        <w:tc>
-          <w:tcPr/>
-          <w:p>
-            <w:pPr>
-              <w:pStyle w:val="Compact"/>
-              <w:jc w:val="left"/>
-            </w:pPr>
-            <w:r>
-              <w:t xml:space="preserve">고를 수 있는 예시</w:t>
-            </w:r>
-          </w:p>
-        </w:tc>
-        <w:tc>
-          <w:tcPr/>
-          <w:p>
-            <w:pPr>
-              <w:pStyle w:val="Compact"/>
-              <w:jc w:val="left"/>
-            </w:pPr>
-            <w:r>
-              <w:t xml:space="preserve">우리 모둠</w:t>
+              <w:t xml:space="preserve">태그</w:t>
+            </w:r>
+          </w:p>
+        </w:tc>
+        <w:tc>
+          <w:tcPr/>
+          <w:p>
+            <w:pPr>
+              <w:pStyle w:val="Compact"/>
+              <w:jc w:val="left"/>
+            </w:pPr>
+            <w:r>
+              <w:t xml:space="preserve">예시</w:t>
+            </w:r>
+          </w:p>
+        </w:tc>
+        <w:tc>
+          <w:tcPr/>
+          <w:p>
+            <w:pPr>
+              <w:pStyle w:val="Compact"/>
+              <w:jc w:val="left"/>
+            </w:pPr>
+            <w:r>
+              <w:t xml:space="preserve">나의 가사 (4~8줄)</w:t>
             </w:r>
           </w:p>
         </w:tc>
@@ -567,19 +672,19 @@
               <w:jc w:val="left"/>
             </w:pPr>
             <w:r>
-              <w:t xml:space="preserve">장르</w:t>
-            </w:r>
-          </w:p>
-        </w:tc>
-        <w:tc>
-          <w:tcPr/>
-          <w:p>
-            <w:pPr>
-              <w:pStyle w:val="Compact"/>
-              <w:jc w:val="left"/>
-            </w:pPr>
-            <w:r>
-              <w:t xml:space="preserve">K-pop, 발라드, 힙합, 록, 어쿠스틱, 로파이</w:t>
+              <w:t xml:space="preserve">[Verse] 1</w:t>
+            </w:r>
+          </w:p>
+        </w:tc>
+        <w:tc>
+          <w:tcPr/>
+          <w:p>
+            <w:pPr>
+              <w:pStyle w:val="Compact"/>
+              <w:jc w:val="left"/>
+            </w:pPr>
+            <w:r>
+              <w:t xml:space="preserve">종이 울리면 창문을 열어</w:t>
             </w:r>
           </w:p>
         </w:tc>
@@ -601,19 +706,19 @@
               <w:jc w:val="left"/>
             </w:pPr>
             <w:r>
-              <w:t xml:space="preserve">분위기</w:t>
-            </w:r>
-          </w:p>
-        </w:tc>
-        <w:tc>
-          <w:tcPr/>
-          <w:p>
-            <w:pPr>
-              <w:pStyle w:val="Compact"/>
-              <w:jc w:val="left"/>
-            </w:pPr>
-            <w:r>
-              <w:t xml:space="preserve">신나는, 청량한, 잔잔한, 감동적인, 웃긴</w:t>
+              <w:t xml:space="preserve">[Verse] 2</w:t>
+            </w:r>
+          </w:p>
+        </w:tc>
+        <w:tc>
+          <w:tcPr/>
+          <w:p>
+            <w:pPr>
+              <w:pStyle w:val="Compact"/>
+              <w:jc w:val="left"/>
+            </w:pPr>
+            <w:r>
+              <w:t xml:space="preserve">우리 웃음이 바람을 타고</w:t>
             </w:r>
           </w:p>
         </w:tc>
@@ -635,19 +740,19 @@
               <w:jc w:val="left"/>
             </w:pPr>
             <w:r>
-              <w:t xml:space="preserve">악기</w:t>
-            </w:r>
-          </w:p>
-        </w:tc>
-        <w:tc>
-          <w:tcPr/>
-          <w:p>
-            <w:pPr>
-              <w:pStyle w:val="Compact"/>
-              <w:jc w:val="left"/>
-            </w:pPr>
-            <w:r>
-              <w:t xml:space="preserve">피아노, 기타, 드럼, 신스, 현악기</w:t>
+              <w:t xml:space="preserve">[Verse] 3</w:t>
+            </w:r>
+          </w:p>
+        </w:tc>
+        <w:tc>
+          <w:tcPr/>
+          <w:p>
+            <w:pPr>
+              <w:pStyle w:val="Compact"/>
+              <w:jc w:val="left"/>
+            </w:pPr>
+            <w:r>
+              <w:t xml:space="preserve">복도 끝까지 달려가면</w:t>
             </w:r>
           </w:p>
         </w:tc>
@@ -669,19 +774,19 @@
               <w:jc w:val="left"/>
             </w:pPr>
             <w:r>
-              <w:t xml:space="preserve">템포</w:t>
-            </w:r>
-          </w:p>
-        </w:tc>
-        <w:tc>
-          <w:tcPr/>
-          <w:p>
-            <w:pPr>
-              <w:pStyle w:val="Compact"/>
-              <w:jc w:val="left"/>
-            </w:pPr>
-            <w:r>
-              <w:t xml:space="preserve">빠른, 보통, 느린</w:t>
+              <w:t xml:space="preserve">[Verse] 4</w:t>
+            </w:r>
+          </w:p>
+        </w:tc>
+        <w:tc>
+          <w:tcPr/>
+          <w:p>
+            <w:pPr>
+              <w:pStyle w:val="Compact"/>
+              <w:jc w:val="left"/>
+            </w:pPr>
+            <w:r>
+              <w:t xml:space="preserve">오늘도 우린 빛나고 있어</w:t>
             </w:r>
           </w:p>
         </w:tc>
@@ -703,19 +808,19 @@
               <w:jc w:val="left"/>
             </w:pPr>
             <w:r>
-              <w:t xml:space="preserve">보컬</w:t>
-            </w:r>
-          </w:p>
-        </w:tc>
-        <w:tc>
-          <w:tcPr/>
-          <w:p>
-            <w:pPr>
-              <w:pStyle w:val="Compact"/>
-              <w:jc w:val="left"/>
-            </w:pPr>
-            <w:r>
-              <w:t xml:space="preserve">여성 보컬, 남성 보컬, 합창, 보컬 없음</w:t>
+              <w:t xml:space="preserve">[Chorus] 1</w:t>
+            </w:r>
+          </w:p>
+        </w:tc>
+        <w:tc>
+          <w:tcPr/>
+          <w:p>
+            <w:pPr>
+              <w:pStyle w:val="Compact"/>
+              <w:jc w:val="left"/>
+            </w:pPr>
+            <w:r>
+              <w:t xml:space="preserve">지금 이 순간 우리가 주인공</w:t>
             </w:r>
           </w:p>
         </w:tc>
@@ -737,19 +842,87 @@
               <w:jc w:val="left"/>
             </w:pPr>
             <w:r>
-              <w:t xml:space="preserve">주제</w:t>
-            </w:r>
-          </w:p>
-        </w:tc>
-        <w:tc>
-          <w:tcPr/>
-          <w:p>
-            <w:pPr>
-              <w:pStyle w:val="Compact"/>
-              <w:jc w:val="left"/>
-            </w:pPr>
-            <w:r>
-              <w:t xml:space="preserve">STEP 1에서 고른 주제</w:t>
+              <w:t xml:space="preserve">[Chorus] 2</w:t>
+            </w:r>
+          </w:p>
+        </w:tc>
+        <w:tc>
+          <w:tcPr/>
+          <w:p>
+            <w:pPr>
+              <w:pStyle w:val="Compact"/>
+              <w:jc w:val="left"/>
+            </w:pPr>
+            <w:r>
+              <w:t xml:space="preserve">함께라면 어디든 갈 수 있어</w:t>
+            </w:r>
+          </w:p>
+        </w:tc>
+        <w:tc>
+          <w:tcPr/>
+          <w:p>
+            <w:pPr>
+              <w:pStyle w:val="Compact"/>
+            </w:pPr>
+          </w:p>
+        </w:tc>
+      </w:tr>
+      <w:tr>
+        <w:tc>
+          <w:tcPr/>
+          <w:p>
+            <w:pPr>
+              <w:pStyle w:val="Compact"/>
+              <w:jc w:val="left"/>
+            </w:pPr>
+            <w:r>
+              <w:t xml:space="preserve">[Chorus] 3</w:t>
+            </w:r>
+          </w:p>
+        </w:tc>
+        <w:tc>
+          <w:tcPr/>
+          <w:p>
+            <w:pPr>
+              <w:pStyle w:val="Compact"/>
+              <w:jc w:val="left"/>
+            </w:pPr>
+            <w:r>
+              <w:t xml:space="preserve">지금 이 순간 우리가 주인공</w:t>
+            </w:r>
+          </w:p>
+        </w:tc>
+        <w:tc>
+          <w:tcPr/>
+          <w:p>
+            <w:pPr>
+              <w:pStyle w:val="Compact"/>
+            </w:pPr>
+          </w:p>
+        </w:tc>
+      </w:tr>
+      <w:tr>
+        <w:tc>
+          <w:tcPr/>
+          <w:p>
+            <w:pPr>
+              <w:pStyle w:val="Compact"/>
+              <w:jc w:val="left"/>
+            </w:pPr>
+            <w:r>
+              <w:t xml:space="preserve">[Chorus] 4</w:t>
+            </w:r>
+          </w:p>
+        </w:tc>
+        <w:tc>
+          <w:tcPr/>
+          <w:p>
+            <w:pPr>
+              <w:pStyle w:val="Compact"/>
+              <w:jc w:val="left"/>
+            </w:pPr>
+            <w:r>
+              <w:t xml:space="preserve">우리의 노래는 계속돼</w:t>
             </w:r>
           </w:p>
         </w:tc>
@@ -763,67 +936,62 @@
         </w:tc>
       </w:tr>
     </w:tbl>
-    <w:p>
-      <w:pPr>
-        <w:pStyle w:val="BodyText"/>
-      </w:pPr>
-      <w:r>
-        <w:rPr>
-          <w:bCs/>
-          <w:b/>
-        </w:rPr>
-        <w:t xml:space="preserve">예시</w:t>
-      </w:r>
-      <w:r>
-        <w:t xml:space="preserve"> </w:t>
-      </w:r>
-      <w:r>
-        <w:t xml:space="preserve">— "신나고 청량한 K-pop 댄스곡, 밝은 신스와 강한 드럼, 빠른 템포, 맑은 여성 보컬, 중학교 친구들과의 우정에 대한 노래"</w:t>
-      </w:r>
-    </w:p>
-    <w:p>
-      <w:pPr>
-        <w:pStyle w:val="BodyText"/>
-      </w:pPr>
-      <w:r>
-        <w:rPr>
-          <w:bCs/>
-          <w:b/>
-        </w:rPr>
-        <w:t xml:space="preserve">우리 모둠 완성 프롬프트</w:t>
-      </w:r>
-      <w:r>
-        <w:t xml:space="preserve"> </w:t>
-      </w:r>
-      <w:r>
-        <w:t xml:space="preserve">(여섯 칸을 한 문장으로)</w:t>
-      </w:r>
-      <w:r>
-        <w:br/>
-      </w:r>
-      <w:r>
-        <w:br/>
-      </w:r>
-      <w:r>
-        <w:br/>
-      </w:r>
-    </w:p>
     <w:bookmarkEnd w:id="22"/>
-    <w:bookmarkStart w:id="23" w:name="step-3-가사-쓰기-5분"/>
+    <w:bookmarkStart w:id="23" w:name="step-4-내-휴대폰으로-ai-노래-만들기-15분"/>
     <w:p>
       <w:pPr>
         <w:pStyle w:val="Heading2"/>
       </w:pPr>
       <w:r>
-        <w:t xml:space="preserve">STEP 3 가사 쓰기 (5분)</w:t>
-      </w:r>
-    </w:p>
-    <w:p>
-      <w:pPr>
-        <w:pStyle w:val="FirstParagraph"/>
-      </w:pPr>
-      <w:r>
-        <w:t xml:space="preserve">대괄호 태그를 넣으면 AI가 노래의 흐름을 알아들어요. 후렴은 짧고, 따라 부르기 쉽게! 친구·연예인의 실제 이름은 넣지 않아요.</w:t>
+        <w:t xml:space="preserve">STEP 4 내 휴대폰으로 AI 노래 만들기 (15분)</w:t>
+      </w:r>
+    </w:p>
+    <w:p>
+      <w:pPr>
+        <w:numPr>
+          <w:ilvl w:val="0"/>
+          <w:numId w:val="1002"/>
+        </w:numPr>
+        <w:pStyle w:val="Compact"/>
+      </w:pPr>
+      <w:r>
+        <w:t xml:space="preserve">칠판 QR을 찍어 선생님이 알려 준 AI 음악 사이트에 접속했다 (회원가입·결제 창은 누르지 않기!)</w:t>
+      </w:r>
+    </w:p>
+    <w:p>
+      <w:pPr>
+        <w:numPr>
+          <w:ilvl w:val="0"/>
+          <w:numId w:val="1002"/>
+        </w:numPr>
+        <w:pStyle w:val="Compact"/>
+      </w:pPr>
+      <w:r>
+        <w:t xml:space="preserve">나의 완성 프롬프트(+가사)를 입력하고 노래를 만들었다</w:t>
+      </w:r>
+    </w:p>
+    <w:p>
+      <w:pPr>
+        <w:numPr>
+          <w:ilvl w:val="0"/>
+          <w:numId w:val="1002"/>
+        </w:numPr>
+        <w:pStyle w:val="Compact"/>
+      </w:pPr>
+      <w:r>
+        <w:t xml:space="preserve">2번 이상 만들어 보고 마음에 드는 곡을 골랐다</w:t>
+      </w:r>
+    </w:p>
+    <w:p>
+      <w:pPr>
+        <w:numPr>
+          <w:ilvl w:val="0"/>
+          <w:numId w:val="1002"/>
+        </w:numPr>
+        <w:pStyle w:val="Compact"/>
+      </w:pPr>
+      <w:r>
+        <w:t xml:space="preserve">MP3로 다운로드해서 휴대폰에서 재생되는 것을 확인했다 (안 되면 패들렛 예비 음원)</w:t>
       </w:r>
     </w:p>
     <w:tbl>
@@ -850,31 +1018,31 @@
               <w:jc w:val="left"/>
             </w:pPr>
             <w:r>
-              <w:t xml:space="preserve">태그</w:t>
-            </w:r>
-          </w:p>
-        </w:tc>
-        <w:tc>
-          <w:tcPr/>
-          <w:p>
-            <w:pPr>
-              <w:pStyle w:val="Compact"/>
-              <w:jc w:val="left"/>
-            </w:pPr>
-            <w:r>
-              <w:t xml:space="preserve">예시</w:t>
-            </w:r>
-          </w:p>
-        </w:tc>
-        <w:tc>
-          <w:tcPr/>
-          <w:p>
-            <w:pPr>
-              <w:pStyle w:val="Compact"/>
-              <w:jc w:val="left"/>
-            </w:pPr>
-            <w:r>
-              <w:t xml:space="preserve">우리 모둠 가사</w:t>
+              <w:t xml:space="preserve">만든 노래 느낌 (한 줄)</w:t>
+            </w:r>
+          </w:p>
+        </w:tc>
+        <w:tc>
+          <w:tcPr/>
+          <w:p>
+            <w:pPr>
+              <w:pStyle w:val="Compact"/>
+              <w:jc w:val="left"/>
+            </w:pPr>
+            <w:r>
+              <w:t xml:space="preserve">프롬프트대로 나왔나요?</w:t>
+            </w:r>
+          </w:p>
+        </w:tc>
+        <w:tc>
+          <w:tcPr/>
+          <w:p>
+            <w:pPr>
+              <w:pStyle w:val="Compact"/>
+              <w:jc w:val="left"/>
+            </w:pPr>
+            <w:r>
+              <w:t xml:space="preserve">다음엔 이렇게 바꿔 볼래요</w:t>
             </w:r>
           </w:p>
         </w:tc>
@@ -885,260 +1053,18 @@
           <w:p>
             <w:pPr>
               <w:pStyle w:val="Compact"/>
-              <w:jc w:val="left"/>
-            </w:pPr>
-            <w:r>
-              <w:t xml:space="preserve">[Verse] 1</w:t>
-            </w:r>
-          </w:p>
-        </w:tc>
-        <w:tc>
-          <w:tcPr/>
-          <w:p>
-            <w:pPr>
-              <w:pStyle w:val="Compact"/>
-              <w:jc w:val="left"/>
-            </w:pPr>
-            <w:r>
-              <w:t xml:space="preserve">종이 울리면 창문을 열어</w:t>
-            </w:r>
-          </w:p>
-        </w:tc>
-        <w:tc>
-          <w:tcPr/>
-          <w:p>
-            <w:pPr>
-              <w:pStyle w:val="Compact"/>
-            </w:pPr>
-          </w:p>
-        </w:tc>
-      </w:tr>
-      <w:tr>
-        <w:tc>
-          <w:tcPr/>
-          <w:p>
-            <w:pPr>
-              <w:pStyle w:val="Compact"/>
-              <w:jc w:val="left"/>
-            </w:pPr>
-            <w:r>
-              <w:t xml:space="preserve">[Verse] 2</w:t>
-            </w:r>
-          </w:p>
-        </w:tc>
-        <w:tc>
-          <w:tcPr/>
-          <w:p>
-            <w:pPr>
-              <w:pStyle w:val="Compact"/>
-              <w:jc w:val="left"/>
-            </w:pPr>
-            <w:r>
-              <w:t xml:space="preserve">우리 웃음이 바람을 타고</w:t>
-            </w:r>
-          </w:p>
-        </w:tc>
-        <w:tc>
-          <w:tcPr/>
-          <w:p>
-            <w:pPr>
-              <w:pStyle w:val="Compact"/>
-            </w:pPr>
-          </w:p>
-        </w:tc>
-      </w:tr>
-      <w:tr>
-        <w:tc>
-          <w:tcPr/>
-          <w:p>
-            <w:pPr>
-              <w:pStyle w:val="Compact"/>
-              <w:jc w:val="left"/>
-            </w:pPr>
-            <w:r>
-              <w:t xml:space="preserve">[Verse] 3</w:t>
-            </w:r>
-          </w:p>
-        </w:tc>
-        <w:tc>
-          <w:tcPr/>
-          <w:p>
-            <w:pPr>
-              <w:pStyle w:val="Compact"/>
-              <w:jc w:val="left"/>
-            </w:pPr>
-            <w:r>
-              <w:t xml:space="preserve">복도 끝까지 달려가면</w:t>
-            </w:r>
-          </w:p>
-        </w:tc>
-        <w:tc>
-          <w:tcPr/>
-          <w:p>
-            <w:pPr>
-              <w:pStyle w:val="Compact"/>
-            </w:pPr>
-          </w:p>
-        </w:tc>
-      </w:tr>
-      <w:tr>
-        <w:tc>
-          <w:tcPr/>
-          <w:p>
-            <w:pPr>
-              <w:pStyle w:val="Compact"/>
-              <w:jc w:val="left"/>
-            </w:pPr>
-            <w:r>
-              <w:t xml:space="preserve">[Verse] 4</w:t>
-            </w:r>
-          </w:p>
-        </w:tc>
-        <w:tc>
-          <w:tcPr/>
-          <w:p>
-            <w:pPr>
-              <w:pStyle w:val="Compact"/>
-              <w:jc w:val="left"/>
-            </w:pPr>
-            <w:r>
-              <w:t xml:space="preserve">오늘도 우린 빛나고 있어</w:t>
-            </w:r>
-          </w:p>
-        </w:tc>
-        <w:tc>
-          <w:tcPr/>
-          <w:p>
-            <w:pPr>
-              <w:pStyle w:val="Compact"/>
-            </w:pPr>
-          </w:p>
-        </w:tc>
-      </w:tr>
-      <w:tr>
-        <w:tc>
-          <w:tcPr/>
-          <w:p>
-            <w:pPr>
-              <w:pStyle w:val="Compact"/>
-              <w:jc w:val="left"/>
-            </w:pPr>
-            <w:r>
-              <w:t xml:space="preserve">[Chorus] 1</w:t>
-            </w:r>
-          </w:p>
-        </w:tc>
-        <w:tc>
-          <w:tcPr/>
-          <w:p>
-            <w:pPr>
-              <w:pStyle w:val="Compact"/>
-              <w:jc w:val="left"/>
-            </w:pPr>
-            <w:r>
-              <w:t xml:space="preserve">지금 이 순간 우리가 주인공</w:t>
-            </w:r>
-          </w:p>
-        </w:tc>
-        <w:tc>
-          <w:tcPr/>
-          <w:p>
-            <w:pPr>
-              <w:pStyle w:val="Compact"/>
-            </w:pPr>
-          </w:p>
-        </w:tc>
-      </w:tr>
-      <w:tr>
-        <w:tc>
-          <w:tcPr/>
-          <w:p>
-            <w:pPr>
-              <w:pStyle w:val="Compact"/>
-              <w:jc w:val="left"/>
-            </w:pPr>
-            <w:r>
-              <w:t xml:space="preserve">[Chorus] 2</w:t>
-            </w:r>
-          </w:p>
-        </w:tc>
-        <w:tc>
-          <w:tcPr/>
-          <w:p>
-            <w:pPr>
-              <w:pStyle w:val="Compact"/>
-              <w:jc w:val="left"/>
-            </w:pPr>
-            <w:r>
-              <w:t xml:space="preserve">함께라면 어디든 갈 수 있어</w:t>
-            </w:r>
-          </w:p>
-        </w:tc>
-        <w:tc>
-          <w:tcPr/>
-          <w:p>
-            <w:pPr>
-              <w:pStyle w:val="Compact"/>
-            </w:pPr>
-          </w:p>
-        </w:tc>
-      </w:tr>
-      <w:tr>
-        <w:tc>
-          <w:tcPr/>
-          <w:p>
-            <w:pPr>
-              <w:pStyle w:val="Compact"/>
-              <w:jc w:val="left"/>
-            </w:pPr>
-            <w:r>
-              <w:t xml:space="preserve">[Chorus] 3</w:t>
-            </w:r>
-          </w:p>
-        </w:tc>
-        <w:tc>
-          <w:tcPr/>
-          <w:p>
-            <w:pPr>
-              <w:pStyle w:val="Compact"/>
-              <w:jc w:val="left"/>
-            </w:pPr>
-            <w:r>
-              <w:t xml:space="preserve">지금 이 순간 우리가 주인공</w:t>
-            </w:r>
-          </w:p>
-        </w:tc>
-        <w:tc>
-          <w:tcPr/>
-          <w:p>
-            <w:pPr>
-              <w:pStyle w:val="Compact"/>
-            </w:pPr>
-          </w:p>
-        </w:tc>
-      </w:tr>
-      <w:tr>
-        <w:tc>
-          <w:tcPr/>
-          <w:p>
-            <w:pPr>
-              <w:pStyle w:val="Compact"/>
-              <w:jc w:val="left"/>
-            </w:pPr>
-            <w:r>
-              <w:t xml:space="preserve">[Chorus] 4</w:t>
-            </w:r>
-          </w:p>
-        </w:tc>
-        <w:tc>
-          <w:tcPr/>
-          <w:p>
-            <w:pPr>
-              <w:pStyle w:val="Compact"/>
-              <w:jc w:val="left"/>
-            </w:pPr>
-            <w:r>
-              <w:t xml:space="preserve">우리의 노래는 계속돼</w:t>
+            </w:pPr>
+          </w:p>
+        </w:tc>
+        <w:tc>
+          <w:tcPr/>
+          <w:p>
+            <w:pPr>
+              <w:pStyle w:val="Compact"/>
+              <w:jc w:val="left"/>
+            </w:pPr>
+            <w:r>
+              <w:t xml:space="preserve">☐ 딱 맞아요 ☐ 비슷해요 ☐ 달라요</w:t>
             </w:r>
           </w:p>
         </w:tc>
@@ -1153,13 +1079,13 @@
       </w:tr>
     </w:tbl>
     <w:bookmarkEnd w:id="23"/>
-    <w:bookmarkStart w:id="24" w:name="step-4-4컷-스토리보드-노래-생성-기다리는-동안"/>
+    <w:bookmarkStart w:id="24" w:name="step-5-4컷-스토리보드-노래가-만들어지는-동안"/>
     <w:p>
       <w:pPr>
         <w:pStyle w:val="Heading2"/>
       </w:pPr>
       <w:r>
-        <w:t xml:space="preserve">STEP 4 4컷 스토리보드 (노래 생성 기다리는 동안)</w:t>
+        <w:t xml:space="preserve">STEP 5 4컷 스토리보드 (노래가 만들어지는 동안)</w:t>
       </w:r>
     </w:p>
     <w:p>
@@ -1281,12 +1207,6 @@
             <w:r>
               <w:t xml:space="preserve">☐ 사진 ☐ 영상</w:t>
             </w:r>
-            <w:r>
-              <w:br/>
-            </w:r>
-            <w:r>
-              <w:t xml:space="preserve">☐ AI 이미지</w:t>
-            </w:r>
           </w:p>
         </w:tc>
       </w:tr>
@@ -1329,12 +1249,6 @@
             <w:r>
               <w:t xml:space="preserve">☐ 사진 ☐ 영상</w:t>
             </w:r>
-            <w:r>
-              <w:br/>
-            </w:r>
-            <w:r>
-              <w:t xml:space="preserve">☐ AI 이미지</w:t>
-            </w:r>
           </w:p>
         </w:tc>
       </w:tr>
@@ -1383,12 +1297,6 @@
             <w:r>
               <w:t xml:space="preserve">☐ 사진 ☐ 영상</w:t>
             </w:r>
-            <w:r>
-              <w:br/>
-            </w:r>
-            <w:r>
-              <w:t xml:space="preserve">☐ AI 이미지</w:t>
-            </w:r>
           </w:p>
         </w:tc>
       </w:tr>
@@ -1437,63 +1345,10 @@
             <w:r>
               <w:t xml:space="preserve">☐ 사진 ☐ 영상</w:t>
             </w:r>
-            <w:r>
-              <w:br/>
-            </w:r>
-            <w:r>
-              <w:t xml:space="preserve">☐ AI 이미지</w:t>
-            </w:r>
           </w:p>
         </w:tc>
       </w:tr>
     </w:tbl>
-    <w:p>
-      <w:pPr>
-        <w:pStyle w:val="BodyText"/>
-      </w:pPr>
-      <w:r>
-        <w:rPr>
-          <w:bCs/>
-          <w:b/>
-        </w:rPr>
-        <w:t xml:space="preserve">AI 이미지 프롬프트</w:t>
-      </w:r>
-      <w:r>
-        <w:t xml:space="preserve"> </w:t>
-      </w:r>
-      <w:r>
-        <w:t xml:space="preserve">(선택, 선생님이 대신 만들어 패들렛에 올려 줘요) — 공식: 피사체 + 동작 + 배경 + 스타일 + 색감</w:t>
-      </w:r>
-    </w:p>
-    <w:p>
-      <w:pPr>
-        <w:pStyle w:val="BodyText"/>
-      </w:pPr>
-      <w:r>
-        <w:t xml:space="preserve">예시: "교복 입은 학생이 노을 지는 운동장을 달리는 모습, 애니메이션 스타일, 따뜻한 황금빛"</w:t>
-      </w:r>
-    </w:p>
-    <w:p>
-      <w:pPr>
-        <w:pStyle w:val="BodyText"/>
-      </w:pPr>
-      <w:r>
-        <w:rPr>
-          <w:bCs/>
-          <w:b/>
-        </w:rPr>
-        <w:t xml:space="preserve">우리 모둠 이미지 프롬프트</w:t>
-      </w:r>
-      <w:r>
-        <w:br/>
-      </w:r>
-      <w:r>
-        <w:br/>
-      </w:r>
-      <w:r>
-        <w:br/>
-      </w:r>
-    </w:p>
     <w:bookmarkEnd w:id="24"/>
     <w:bookmarkStart w:id="25" w:name="차시-capcut으로-뮤직비디오-편집하기"/>
     <w:p>
@@ -1516,19 +1371,19 @@
       <w:pPr>
         <w:numPr>
           <w:ilvl w:val="0"/>
-          <w:numId w:val="1002"/>
+          <w:numId w:val="1003"/>
         </w:numPr>
         <w:pStyle w:val="Compact"/>
       </w:pPr>
       <w:r>
-        <w:t xml:space="preserve">패들렛 QR에서 우리 모둠 노래(MP3)를 휴대폰에 저장했다</w:t>
+        <w:t xml:space="preserve">내 노래(MP3)가 휴대폰에 저장되어 있다</w:t>
       </w:r>
     </w:p>
     <w:p>
       <w:pPr>
         <w:numPr>
           <w:ilvl w:val="0"/>
-          <w:numId w:val="1002"/>
+          <w:numId w:val="1003"/>
         </w:numPr>
         <w:pStyle w:val="Compact"/>
       </w:pPr>
@@ -1540,7 +1395,7 @@
       <w:pPr>
         <w:numPr>
           <w:ilvl w:val="0"/>
-          <w:numId w:val="1002"/>
+          <w:numId w:val="1003"/>
         </w:numPr>
         <w:pStyle w:val="Compact"/>
       </w:pPr>
@@ -1552,19 +1407,19 @@
       <w:pPr>
         <w:numPr>
           <w:ilvl w:val="0"/>
-          <w:numId w:val="1002"/>
+          <w:numId w:val="1003"/>
         </w:numPr>
         <w:pStyle w:val="Compact"/>
       </w:pPr>
       <w:r>
-        <w:t xml:space="preserve">오디오 → 우리 모둠 노래를 넣었다</w:t>
+        <w:t xml:space="preserve">오디오 → 내 노래를 넣었다</w:t>
       </w:r>
     </w:p>
     <w:p>
       <w:pPr>
         <w:numPr>
           <w:ilvl w:val="0"/>
-          <w:numId w:val="1002"/>
+          <w:numId w:val="1003"/>
         </w:numPr>
         <w:pStyle w:val="Compact"/>
       </w:pPr>
@@ -1576,7 +1431,7 @@
       <w:pPr>
         <w:numPr>
           <w:ilvl w:val="0"/>
-          <w:numId w:val="1002"/>
+          <w:numId w:val="1003"/>
         </w:numPr>
         <w:pStyle w:val="Compact"/>
       </w:pPr>
@@ -1588,7 +1443,7 @@
       <w:pPr>
         <w:numPr>
           <w:ilvl w:val="0"/>
-          <w:numId w:val="1002"/>
+          <w:numId w:val="1003"/>
         </w:numPr>
         <w:pStyle w:val="Compact"/>
       </w:pPr>
@@ -1600,7 +1455,7 @@
       <w:pPr>
         <w:numPr>
           <w:ilvl w:val="0"/>
-          <w:numId w:val="1002"/>
+          <w:numId w:val="1003"/>
         </w:numPr>
         <w:pStyle w:val="Compact"/>
       </w:pPr>
@@ -1612,7 +1467,7 @@
       <w:pPr>
         <w:numPr>
           <w:ilvl w:val="0"/>
-          <w:numId w:val="1002"/>
+          <w:numId w:val="1003"/>
         </w:numPr>
         <w:pStyle w:val="Compact"/>
       </w:pPr>
@@ -1629,13 +1484,13 @@
       </w:r>
     </w:p>
     <w:bookmarkEnd w:id="25"/>
-    <w:bookmarkStart w:id="26" w:name="상영회-피드백-칭찬-1-제안-1"/>
+    <w:bookmarkStart w:id="26" w:name="짝-피드백-칭찬-1-제안-1"/>
     <w:p>
       <w:pPr>
         <w:pStyle w:val="Heading2"/>
       </w:pPr>
       <w:r>
-        <w:t xml:space="preserve">상영회 피드백 (칭찬 1 + 제안 1)</w:t>
+        <w:t xml:space="preserve">짝 피드백 (칭찬 1 + 제안 1)</w:t>
       </w:r>
     </w:p>
     <w:p>
@@ -1643,7 +1498,7 @@
         <w:pStyle w:val="FirstParagraph"/>
       </w:pPr>
       <w:r>
-        <w:t xml:space="preserve">감상 포인트: 음악과 영상의 어울림, 창의성, 메시지</w:t>
+        <w:t xml:space="preserve">짝과 휴대폰을 바꿔 서로의 작품을 봐요. 감상 포인트: 음악과 영상의 어울림, 창의성, 메시지</w:t>
       </w:r>
     </w:p>
     <w:tbl>
@@ -1670,7 +1525,7 @@
               <w:jc w:val="left"/>
             </w:pPr>
             <w:r>
-              <w:t xml:space="preserve">모둠</w:t>
+              <w:t xml:space="preserve">친구 이름</w:t>
             </w:r>
           </w:p>
         </w:tc>
@@ -1705,11 +1560,7 @@
           <w:p>
             <w:pPr>
               <w:pStyle w:val="Compact"/>
-              <w:jc w:val="left"/>
-            </w:pPr>
-            <w:r>
-              <w:t xml:space="preserve">모둠</w:t>
-            </w:r>
+            </w:pPr>
           </w:p>
         </w:tc>
         <w:tc>
@@ -1735,41 +1586,7 @@
           <w:p>
             <w:pPr>
               <w:pStyle w:val="Compact"/>
-              <w:jc w:val="left"/>
-            </w:pPr>
-            <w:r>
-              <w:t xml:space="preserve">모둠</w:t>
-            </w:r>
-          </w:p>
-        </w:tc>
-        <w:tc>
-          <w:tcPr/>
-          <w:p>
-            <w:pPr>
-              <w:pStyle w:val="Compact"/>
-            </w:pPr>
-          </w:p>
-        </w:tc>
-        <w:tc>
-          <w:tcPr/>
-          <w:p>
-            <w:pPr>
-              <w:pStyle w:val="Compact"/>
-            </w:pPr>
-          </w:p>
-        </w:tc>
-      </w:tr>
-      <w:tr>
-        <w:tc>
-          <w:tcPr/>
-          <w:p>
-            <w:pPr>
-              <w:pStyle w:val="Compact"/>
-              <w:jc w:val="left"/>
-            </w:pPr>
-            <w:r>
-              <w:t xml:space="preserve">모둠</w:t>
-            </w:r>
+            </w:pPr>
           </w:p>
         </w:tc>
         <w:tc>
@@ -1804,7 +1621,7 @@
       <w:pPr>
         <w:numPr>
           <w:ilvl w:val="0"/>
-          <w:numId w:val="1003"/>
+          <w:numId w:val="1004"/>
         </w:numPr>
         <w:pStyle w:val="Compact"/>
       </w:pPr>
@@ -1816,7 +1633,7 @@
       <w:pPr>
         <w:numPr>
           <w:ilvl w:val="0"/>
-          <w:numId w:val="1003"/>
+          <w:numId w:val="1004"/>
         </w:numPr>
         <w:pStyle w:val="Compact"/>
       </w:pPr>
@@ -1828,7 +1645,7 @@
       <w:pPr>
         <w:numPr>
           <w:ilvl w:val="0"/>
-          <w:numId w:val="1003"/>
+          <w:numId w:val="1004"/>
         </w:numPr>
         <w:pStyle w:val="Compact"/>
       </w:pPr>
@@ -1840,7 +1657,7 @@
       <w:pPr>
         <w:numPr>
           <w:ilvl w:val="0"/>
-          <w:numId w:val="1003"/>
+          <w:numId w:val="1004"/>
         </w:numPr>
         <w:pStyle w:val="Compact"/>
       </w:pPr>
@@ -2111,6 +1928,9 @@
     <w:abstractNumId w:val="991"/>
   </w:num>
   <w:num w:numId="1003">
+    <w:abstractNumId w:val="991"/>
+  </w:num>
+  <w:num w:numId="1004">
     <w:abstractNumId w:val="991"/>
   </w:num>
 </w:numbering>

</xml_diff>